<commit_message>
fix(lecons): quatre coquilles sur la leçon hypnose n°12
Une seule comptait : « Guéguen » pour Juliette GUEGUEN, sans accent,
autrice du rapport INSERM de 2015 remis à la Direction générale de la
santé. C'est la source la plus citée de la leçon et celle qui a été
ajoutée aux ressources de la leçon 11 le 25/08 — un nom mal orthographié
la rend introuvable. Le prénom est ajouté pour la même raison, et le
journal cite les trois cosignataires.

Les autres étaient de forme : « la référence française de référence en
évaluation » (répétition), « focalisiation », « Identifie-tu ».

Co-Authored-By: Claude Opus 5 <noreply@anthropic.com>
</commit_message>
<xml_diff>
--- a/livrables/lecons/2026-09-01_lecon-hypnose_12_hypnose-douleur-usages-documentes.docx
+++ b/livrables/lecons/2026-09-01_lecon-hypnose_12_hypnose-douleur-usages-documentes.docx
@@ -313,7 +313,7 @@
           <w:sz w:val="22"/>
           <w:szCs w:val="22"/>
         </w:rPr>
-        <w:t xml:space="preserve">La question de l'hypnose et de la douleur est l'une des mieux documentées de tout le champ. Le rapport de l'INSERM de 2015 (Guéguen et al.) — qui reste la référence française de référence en évaluation — a analysé des dizaines d'essais cliniques contrôlés et conclut à des preuves suffisantes dans deux domaines principaux :</w:t>
+        <w:t xml:space="preserve">La question de l'hypnose et de la douleur est l'une des mieux documentées de tout le champ. Le rapport de l'INSERM de 2015 (Juliette Gueguen et al.) — qui reste la référence française en matière d'évaluation — a analysé des dizaines d'essais cliniques contrôlés et conclut à des preuves suffisantes dans deux domaines principaux :</w:t>
       </w:r>
     </w:p>
     <w:p>
@@ -2431,7 +2431,7 @@
           <w:sz w:val="22"/>
           <w:szCs w:val="22"/>
         </w:rPr>
-        <w:t xml:space="preserve">À la fin des 3 semaines : rédige une synthèse de 10 lignes dans ton journal. Quelle technique a le mieux fonctionné pour toi ? Identifie-tu une corrélation entre ton niveau de focalisiation initiale (qualité de l'induction) et l'effet obtenu ?</w:t>
+        <w:t xml:space="preserve">À la fin des 3 semaines : rédige une synthèse de 10 lignes dans ton journal. Quelle technique a le mieux fonctionné pour toi ? Identifies-tu une corrélation entre ton niveau de focalisation initiale (qualité de l'induction) et l'effet obtenu ?</w:t>
       </w:r>
     </w:p>
     <w:p>
@@ -2856,6 +2856,88 @@
           <w:szCs w:val="20"/>
         </w:rPr>
         <w:t xml:space="preserve">─────────────────────────────────────────────────────────</w:t>
+      </w:r>
+    </w:p>
+    <w:p>
+      <w:pPr>
+        <w:spacing w:after="120" w:before="280"/>
+      </w:pPr>
+      <w:r>
+        <w:rPr>
+          <w:rFonts w:ascii="Times New Roman" w:cs="Times New Roman" w:eastAsia="Times New Roman" w:hAnsi="Times New Roman"/>
+          <w:b/>
+          <w:bCs/>
+          <w:color w:val="1B3A6B"/>
+          <w:sz w:val="30"/>
+          <w:szCs w:val="30"/>
+        </w:rPr>
+        <w:t xml:space="preserve">📝 Journal des corrections</w:t>
+      </w:r>
+    </w:p>
+    <w:p>
+      <w:pPr>
+        <w:spacing w:after="80" w:before="80"/>
+      </w:pPr>
+      <w:r>
+        <w:rPr>
+          <w:rFonts w:ascii="Times New Roman" w:cs="Times New Roman" w:eastAsia="Times New Roman" w:hAnsi="Times New Roman"/>
+          <w:i/>
+          <w:iCs/>
+          <w:color w:val="1B3A6B"/>
+          <w:sz w:val="22"/>
+          <w:szCs w:val="22"/>
+        </w:rPr>
+        <w:t xml:space="preserve">Corrections apportées le 1ᵉʳ septembre 2026. Les formulations d'origine sont conservées ci-dessous.</w:t>
+      </w:r>
+    </w:p>
+    <w:p>
+      <w:pPr>
+        <w:spacing w:after="60" w:before="60"/>
+      </w:pPr>
+      <w:r>
+        <w:rPr>
+          <w:rFonts w:ascii="Times New Roman" w:cs="Times New Roman" w:eastAsia="Times New Roman" w:hAnsi="Times New Roman"/>
+          <w:b/>
+          <w:bCs/>
+          <w:color w:val="1F2937"/>
+          <w:sz w:val="22"/>
+          <w:szCs w:val="22"/>
+        </w:rPr>
+        <w:t xml:space="preserve">1. « Guéguen et al. » — </w:t>
+      </w:r>
+      <w:r>
+        <w:rPr>
+          <w:rFonts w:ascii="Times New Roman" w:cs="Times New Roman" w:eastAsia="Times New Roman" w:hAnsi="Times New Roman"/>
+          <w:color w:val="1F2937"/>
+          <w:sz w:val="22"/>
+          <w:szCs w:val="22"/>
+        </w:rPr>
+        <w:t xml:space="preserve">l'autrice du rapport INSERM de 2015 s'écrit Juliette GUEGUEN, sans accent. Le prénom a été ajouté : c'est la source la plus citée de cette leçon, et la référence doit rester trouvable. Le rapport, remis à la Direction générale de la santé, est cosigné avec Caroline Barry, Christine Hassler et Bruno Falissard.</w:t>
+      </w:r>
+    </w:p>
+    <w:p>
+      <w:pPr>
+        <w:spacing w:after="60" w:before="60"/>
+      </w:pPr>
+      <w:r>
+        <w:rPr>
+          <w:rFonts w:ascii="Times New Roman" w:cs="Times New Roman" w:eastAsia="Times New Roman" w:hAnsi="Times New Roman"/>
+          <w:b/>
+          <w:bCs/>
+          <w:color w:val="1F2937"/>
+          <w:sz w:val="22"/>
+          <w:szCs w:val="22"/>
+        </w:rPr>
+        <w:t xml:space="preserve">2. Trois coquilles — </w:t>
+      </w:r>
+      <w:r>
+        <w:rPr>
+          <w:rFonts w:ascii="Times New Roman" w:cs="Times New Roman" w:eastAsia="Times New Roman" w:hAnsi="Times New Roman"/>
+          <w:color w:val="1F2937"/>
+          <w:sz w:val="22"/>
+          <w:szCs w:val="22"/>
+        </w:rPr>
+        <w:t xml:space="preserve">« la référence française de référence en évaluation » (répétition) devient « la référence française en matière d'évaluation » ; « focalisiation » devient « focalisation » ; « Identifie-tu » devient « Identifies-tu ».</w:t>
       </w:r>
     </w:p>
     <w:p>

</xml_diff>